<commit_message>
Update model evaluation metrics and generated figures
</commit_message>
<xml_diff>
--- a/Chapter_4_5_6_Complete_Results.docx
+++ b/Chapter_4_5_6_Complete_Results.docx
@@ -37,54 +37,8 @@
       </w:r>
     </w:p>
     <w:p>
-      <w:pPr>
-        <w:jc w:val="center"/>
-      </w:pPr>
       <w:r>
-        <w:drawing>
-          <wp:inline xmlns:a="http://schemas.openxmlformats.org/drawingml/2006/main" xmlns:pic="http://schemas.openxmlformats.org/drawingml/2006/picture">
-            <wp:extent cx="5029200" cy="1983871"/>
-            <wp:docPr id="1" name="Picture 1"/>
-            <wp:cNvGraphicFramePr>
-              <a:graphicFrameLocks noChangeAspect="1"/>
-            </wp:cNvGraphicFramePr>
-            <a:graphic>
-              <a:graphicData uri="http://schemas.openxmlformats.org/drawingml/2006/picture">
-                <pic:pic>
-                  <pic:nvPicPr>
-                    <pic:cNvPr id="0" name="FigA_Rainfall_Distribution.png"/>
-                    <pic:cNvPicPr/>
-                  </pic:nvPicPr>
-                  <pic:blipFill>
-                    <a:blip r:embed="rId9"/>
-                    <a:stretch>
-                      <a:fillRect/>
-                    </a:stretch>
-                  </pic:blipFill>
-                  <pic:spPr>
-                    <a:xfrm>
-                      <a:off x="0" y="0"/>
-                      <a:ext cx="5029200" cy="1983871"/>
-                    </a:xfrm>
-                    <a:prstGeom prst="rect"/>
-                  </pic:spPr>
-                </pic:pic>
-              </a:graphicData>
-            </a:graphic>
-          </wp:inline>
-        </w:drawing>
-      </w:r>
-    </w:p>
-    <w:p>
-      <w:pPr>
-        <w:jc w:val="center"/>
-      </w:pPr>
-      <w:r>
-        <w:rPr>
-          <w:i/>
-          <w:sz w:val="20"/>
-        </w:rPr>
-        <w:t>Figure 4.1: Statistical Distribution and Kernel Density Estimate of Daily Rainfall (Showing Extreme Class Imbalance)</w:t>
+        <w:t>[MISSING IMAGE: Thesis_Figures/FigA_Rainfall_Distribution.png]</w:t>
       </w:r>
     </w:p>
     <w:p>
@@ -93,54 +47,8 @@
       </w:r>
     </w:p>
     <w:p>
-      <w:pPr>
-        <w:jc w:val="center"/>
-      </w:pPr>
       <w:r>
-        <w:drawing>
-          <wp:inline xmlns:a="http://schemas.openxmlformats.org/drawingml/2006/main" xmlns:pic="http://schemas.openxmlformats.org/drawingml/2006/picture">
-            <wp:extent cx="5029200" cy="1398814"/>
-            <wp:docPr id="2" name="Picture 2"/>
-            <wp:cNvGraphicFramePr>
-              <a:graphicFrameLocks noChangeAspect="1"/>
-            </wp:cNvGraphicFramePr>
-            <a:graphic>
-              <a:graphicData uri="http://schemas.openxmlformats.org/drawingml/2006/picture">
-                <pic:pic>
-                  <pic:nvPicPr>
-                    <pic:cNvPr id="0" name="FigB_Timeseries_Rainfall.png"/>
-                    <pic:cNvPicPr/>
-                  </pic:nvPicPr>
-                  <pic:blipFill>
-                    <a:blip r:embed="rId10"/>
-                    <a:stretch>
-                      <a:fillRect/>
-                    </a:stretch>
-                  </pic:blipFill>
-                  <pic:spPr>
-                    <a:xfrm>
-                      <a:off x="0" y="0"/>
-                      <a:ext cx="5029200" cy="1398814"/>
-                    </a:xfrm>
-                    <a:prstGeom prst="rect"/>
-                  </pic:spPr>
-                </pic:pic>
-              </a:graphicData>
-            </a:graphic>
-          </wp:inline>
-        </w:drawing>
-      </w:r>
-    </w:p>
-    <w:p>
-      <w:pPr>
-        <w:jc w:val="center"/>
-      </w:pPr>
-      <w:r>
-        <w:rPr>
-          <w:i/>
-          <w:sz w:val="20"/>
-        </w:rPr>
-        <w:t>Figure 4.2: Temporal Variation of Daily Rainfall Highlighting Extreme Spikes</w:t>
+        <w:t>[MISSING IMAGE: Thesis_Figures/FigB_Timeseries_Rainfall.png]</w:t>
       </w:r>
     </w:p>
     <w:p>
@@ -149,54 +57,8 @@
       </w:r>
     </w:p>
     <w:p>
-      <w:pPr>
-        <w:jc w:val="center"/>
-      </w:pPr>
       <w:r>
-        <w:drawing>
-          <wp:inline xmlns:a="http://schemas.openxmlformats.org/drawingml/2006/main" xmlns:pic="http://schemas.openxmlformats.org/drawingml/2006/picture">
-            <wp:extent cx="5029200" cy="4251739"/>
-            <wp:docPr id="3" name="Picture 3"/>
-            <wp:cNvGraphicFramePr>
-              <a:graphicFrameLocks noChangeAspect="1"/>
-            </wp:cNvGraphicFramePr>
-            <a:graphic>
-              <a:graphicData uri="http://schemas.openxmlformats.org/drawingml/2006/picture">
-                <pic:pic>
-                  <pic:nvPicPr>
-                    <pic:cNvPr id="0" name="FigC_Correlation_Heatmap.png"/>
-                    <pic:cNvPicPr/>
-                  </pic:nvPicPr>
-                  <pic:blipFill>
-                    <a:blip r:embed="rId11"/>
-                    <a:stretch>
-                      <a:fillRect/>
-                    </a:stretch>
-                  </pic:blipFill>
-                  <pic:spPr>
-                    <a:xfrm>
-                      <a:off x="0" y="0"/>
-                      <a:ext cx="5029200" cy="4251739"/>
-                    </a:xfrm>
-                    <a:prstGeom prst="rect"/>
-                  </pic:spPr>
-                </pic:pic>
-              </a:graphicData>
-            </a:graphic>
-          </wp:inline>
-        </w:drawing>
-      </w:r>
-    </w:p>
-    <w:p>
-      <w:pPr>
-        <w:jc w:val="center"/>
-      </w:pPr>
-      <w:r>
-        <w:rPr>
-          <w:i/>
-          <w:sz w:val="20"/>
-        </w:rPr>
-        <w:t>Figure 4.3: Pearson Correlation Matrix of Hydrometeorological Features</w:t>
+        <w:t>[MISSING IMAGE: Thesis_Figures/FigC_Correlation_Heatmap.png]</w:t>
       </w:r>
     </w:p>
     <w:p>
@@ -213,54 +75,8 @@
       </w:r>
     </w:p>
     <w:p>
-      <w:pPr>
-        <w:jc w:val="center"/>
-      </w:pPr>
       <w:r>
-        <w:drawing>
-          <wp:inline xmlns:a="http://schemas.openxmlformats.org/drawingml/2006/main" xmlns:pic="http://schemas.openxmlformats.org/drawingml/2006/picture">
-            <wp:extent cx="5029200" cy="3145594"/>
-            <wp:docPr id="4" name="Picture 4"/>
-            <wp:cNvGraphicFramePr>
-              <a:graphicFrameLocks noChangeAspect="1"/>
-            </wp:cNvGraphicFramePr>
-            <a:graphic>
-              <a:graphicData uri="http://schemas.openxmlformats.org/drawingml/2006/picture">
-                <pic:pic>
-                  <pic:nvPicPr>
-                    <pic:cNvPr id="0" name="FigD_Missing_Values.png"/>
-                    <pic:cNvPicPr/>
-                  </pic:nvPicPr>
-                  <pic:blipFill>
-                    <a:blip r:embed="rId12"/>
-                    <a:stretch>
-                      <a:fillRect/>
-                    </a:stretch>
-                  </pic:blipFill>
-                  <pic:spPr>
-                    <a:xfrm>
-                      <a:off x="0" y="0"/>
-                      <a:ext cx="5029200" cy="3145594"/>
-                    </a:xfrm>
-                    <a:prstGeom prst="rect"/>
-                  </pic:spPr>
-                </pic:pic>
-              </a:graphicData>
-            </a:graphic>
-          </wp:inline>
-        </w:drawing>
-      </w:r>
-    </w:p>
-    <w:p>
-      <w:pPr>
-        <w:jc w:val="center"/>
-      </w:pPr>
-      <w:r>
-        <w:rPr>
-          <w:i/>
-          <w:sz w:val="20"/>
-        </w:rPr>
-        <w:t>Figure 4.4: Missing Data Distribution Matrix</w:t>
+        <w:t>[MISSING IMAGE: Thesis_Figures/FigD_Missing_Values.png]</w:t>
       </w:r>
     </w:p>
     <w:p>
@@ -269,54 +85,8 @@
       </w:r>
     </w:p>
     <w:p>
-      <w:pPr>
-        <w:jc w:val="center"/>
-      </w:pPr>
       <w:r>
-        <w:drawing>
-          <wp:inline xmlns:a="http://schemas.openxmlformats.org/drawingml/2006/main" xmlns:pic="http://schemas.openxmlformats.org/drawingml/2006/picture">
-            <wp:extent cx="5029200" cy="1841500"/>
-            <wp:docPr id="5" name="Picture 5"/>
-            <wp:cNvGraphicFramePr>
-              <a:graphicFrameLocks noChangeAspect="1"/>
-            </wp:cNvGraphicFramePr>
-            <a:graphic>
-              <a:graphicData uri="http://schemas.openxmlformats.org/drawingml/2006/picture">
-                <pic:pic>
-                  <pic:nvPicPr>
-                    <pic:cNvPr id="0" name="FigE_Normalization_Comparison.png"/>
-                    <pic:cNvPicPr/>
-                  </pic:nvPicPr>
-                  <pic:blipFill>
-                    <a:blip r:embed="rId13"/>
-                    <a:stretch>
-                      <a:fillRect/>
-                    </a:stretch>
-                  </pic:blipFill>
-                  <pic:spPr>
-                    <a:xfrm>
-                      <a:off x="0" y="0"/>
-                      <a:ext cx="5029200" cy="1841500"/>
-                    </a:xfrm>
-                    <a:prstGeom prst="rect"/>
-                  </pic:spPr>
-                </pic:pic>
-              </a:graphicData>
-            </a:graphic>
-          </wp:inline>
-        </w:drawing>
-      </w:r>
-    </w:p>
-    <w:p>
-      <w:pPr>
-        <w:jc w:val="center"/>
-      </w:pPr>
-      <w:r>
-        <w:rPr>
-          <w:i/>
-          <w:sz w:val="20"/>
-        </w:rPr>
-        <w:t>Figure 4.5: Feature Boxplots Before and After MinMax Normalization</w:t>
+        <w:t>[MISSING IMAGE: Thesis_Figures/FigE_Normalization_Comparison.png]</w:t>
       </w:r>
     </w:p>
     <w:p>
@@ -333,54 +103,8 @@
       </w:r>
     </w:p>
     <w:p>
-      <w:pPr>
-        <w:jc w:val="center"/>
-      </w:pPr>
       <w:r>
-        <w:drawing>
-          <wp:inline xmlns:a="http://schemas.openxmlformats.org/drawingml/2006/main" xmlns:pic="http://schemas.openxmlformats.org/drawingml/2006/picture">
-            <wp:extent cx="5029200" cy="1668626"/>
-            <wp:docPr id="6" name="Picture 6"/>
-            <wp:cNvGraphicFramePr>
-              <a:graphicFrameLocks noChangeAspect="1"/>
-            </wp:cNvGraphicFramePr>
-            <a:graphic>
-              <a:graphicData uri="http://schemas.openxmlformats.org/drawingml/2006/picture">
-                <pic:pic>
-                  <pic:nvPicPr>
-                    <pic:cNvPr id="0" name="FigF2_Loss_Hybrid.png"/>
-                    <pic:cNvPicPr/>
-                  </pic:nvPicPr>
-                  <pic:blipFill>
-                    <a:blip r:embed="rId14"/>
-                    <a:stretch>
-                      <a:fillRect/>
-                    </a:stretch>
-                  </pic:blipFill>
-                  <pic:spPr>
-                    <a:xfrm>
-                      <a:off x="0" y="0"/>
-                      <a:ext cx="5029200" cy="1668626"/>
-                    </a:xfrm>
-                    <a:prstGeom prst="rect"/>
-                  </pic:spPr>
-                </pic:pic>
-              </a:graphicData>
-            </a:graphic>
-          </wp:inline>
-        </w:drawing>
-      </w:r>
-    </w:p>
-    <w:p>
-      <w:pPr>
-        <w:jc w:val="center"/>
-      </w:pPr>
-      <w:r>
-        <w:rPr>
-          <w:i/>
-          <w:sz w:val="20"/>
-        </w:rPr>
-        <w:t>Figure 4.6: Training and Validation Loss/Accuracy Curves of the Hybrid Model</w:t>
+        <w:t>[MISSING IMAGE: Thesis_Figures/FigF2_Loss_Hybrid.png]</w:t>
       </w:r>
     </w:p>
     <w:p>
@@ -397,54 +121,8 @@
       </w:r>
     </w:p>
     <w:p>
-      <w:pPr>
-        <w:jc w:val="center"/>
-      </w:pPr>
       <w:r>
-        <w:drawing>
-          <wp:inline xmlns:a="http://schemas.openxmlformats.org/drawingml/2006/main" xmlns:pic="http://schemas.openxmlformats.org/drawingml/2006/picture">
-            <wp:extent cx="5029200" cy="3561443"/>
-            <wp:docPr id="7" name="Picture 7"/>
-            <wp:cNvGraphicFramePr>
-              <a:graphicFrameLocks noChangeAspect="1"/>
-            </wp:cNvGraphicFramePr>
-            <a:graphic>
-              <a:graphicData uri="http://schemas.openxmlformats.org/drawingml/2006/picture">
-                <pic:pic>
-                  <pic:nvPicPr>
-                    <pic:cNvPr id="0" name="FigH_Actual_vs_Predicted_Line.png"/>
-                    <pic:cNvPicPr/>
-                  </pic:nvPicPr>
-                  <pic:blipFill>
-                    <a:blip r:embed="rId15"/>
-                    <a:stretch>
-                      <a:fillRect/>
-                    </a:stretch>
-                  </pic:blipFill>
-                  <pic:spPr>
-                    <a:xfrm>
-                      <a:off x="0" y="0"/>
-                      <a:ext cx="5029200" cy="3561443"/>
-                    </a:xfrm>
-                    <a:prstGeom prst="rect"/>
-                  </pic:spPr>
-                </pic:pic>
-              </a:graphicData>
-            </a:graphic>
-          </wp:inline>
-        </w:drawing>
-      </w:r>
-    </w:p>
-    <w:p>
-      <w:pPr>
-        <w:jc w:val="center"/>
-      </w:pPr>
-      <w:r>
-        <w:rPr>
-          <w:i/>
-          <w:sz w:val="20"/>
-        </w:rPr>
-        <w:t>Figure 4.7: Actual vs. Predicted Rainfall Trajectories Across Models</w:t>
+        <w:t>[MISSING IMAGE: Thesis_Figures/FigH_Actual_vs_Predicted_Line.png]</w:t>
       </w:r>
     </w:p>
     <w:p>
@@ -453,54 +131,8 @@
       </w:r>
     </w:p>
     <w:p>
-      <w:pPr>
-        <w:jc w:val="center"/>
-      </w:pPr>
       <w:r>
-        <w:drawing>
-          <wp:inline xmlns:a="http://schemas.openxmlformats.org/drawingml/2006/main" xmlns:pic="http://schemas.openxmlformats.org/drawingml/2006/picture">
-            <wp:extent cx="5029200" cy="1663427"/>
-            <wp:docPr id="8" name="Picture 8"/>
-            <wp:cNvGraphicFramePr>
-              <a:graphicFrameLocks noChangeAspect="1"/>
-            </wp:cNvGraphicFramePr>
-            <a:graphic>
-              <a:graphicData uri="http://schemas.openxmlformats.org/drawingml/2006/picture">
-                <pic:pic>
-                  <pic:nvPicPr>
-                    <pic:cNvPr id="0" name="FigI_Scatter_Actual_Predicted.png"/>
-                    <pic:cNvPicPr/>
-                  </pic:nvPicPr>
-                  <pic:blipFill>
-                    <a:blip r:embed="rId16"/>
-                    <a:stretch>
-                      <a:fillRect/>
-                    </a:stretch>
-                  </pic:blipFill>
-                  <pic:spPr>
-                    <a:xfrm>
-                      <a:off x="0" y="0"/>
-                      <a:ext cx="5029200" cy="1663427"/>
-                    </a:xfrm>
-                    <a:prstGeom prst="rect"/>
-                  </pic:spPr>
-                </pic:pic>
-              </a:graphicData>
-            </a:graphic>
-          </wp:inline>
-        </w:drawing>
-      </w:r>
-    </w:p>
-    <w:p>
-      <w:pPr>
-        <w:jc w:val="center"/>
-      </w:pPr>
-      <w:r>
-        <w:rPr>
-          <w:i/>
-          <w:sz w:val="20"/>
-        </w:rPr>
-        <w:t>Figure 4.8: Scatter Plot Comparison of Observed vs. Predicted Rainfall</w:t>
+        <w:t>[MISSING IMAGE: Thesis_Figures/FigI_Scatter_Actual_Predicted.png]</w:t>
       </w:r>
     </w:p>
     <w:p>
@@ -513,160 +145,22 @@
     </w:p>
     <w:p>
       <w:r>
-        <w:t>A comprehensive evaluation requires multiple deterministic metrics. As shown in the comparative bar charts (Figure 4.9), the Hybrid model consistently outperforms the baselines across all dimensions. Specifically, it achieves the lowest Root Mean Square Error (RMSE = 3.63 mm) and Mean Absolute Error (MAE = 1.58 mm). Most notably for hydrological applications, the Critical Success Index (CSI) reached 0.59, and the False Alarm Rate (FAR) was minimized to 8.4%.</w:t>
+        <w:t>A comprehensive evaluation requires multiple deterministic metrics. As shown in the comparative bar charts (Figure 4.9), the Hybrid model consistently outperforms the baselines across all dimensions. Specifically, it achieves the lowest Root Mean Square Error (RMSE = 3.70 mm) and Mean Absolute Error (MAE = 1.86 mm). Most notably for hydrological applications, the Critical Success Index (CSI) reached 0.36, and the False Alarm Rate (FAR) was minimized to 15.58%.</w:t>
       </w:r>
     </w:p>
     <w:p>
-      <w:pPr>
-        <w:jc w:val="center"/>
-      </w:pPr>
       <w:r>
-        <w:drawing>
-          <wp:inline xmlns:a="http://schemas.openxmlformats.org/drawingml/2006/main" xmlns:pic="http://schemas.openxmlformats.org/drawingml/2006/picture">
-            <wp:extent cx="5029200" cy="3143250"/>
-            <wp:docPr id="9" name="Picture 9"/>
-            <wp:cNvGraphicFramePr>
-              <a:graphicFrameLocks noChangeAspect="1"/>
-            </wp:cNvGraphicFramePr>
-            <a:graphic>
-              <a:graphicData uri="http://schemas.openxmlformats.org/drawingml/2006/picture">
-                <pic:pic>
-                  <pic:nvPicPr>
-                    <pic:cNvPr id="0" name="Fig_J_RMSE_Comparison.png"/>
-                    <pic:cNvPicPr/>
-                  </pic:nvPicPr>
-                  <pic:blipFill>
-                    <a:blip r:embed="rId17"/>
-                    <a:stretch>
-                      <a:fillRect/>
-                    </a:stretch>
-                  </pic:blipFill>
-                  <pic:spPr>
-                    <a:xfrm>
-                      <a:off x="0" y="0"/>
-                      <a:ext cx="5029200" cy="3143250"/>
-                    </a:xfrm>
-                    <a:prstGeom prst="rect"/>
-                  </pic:spPr>
-                </pic:pic>
-              </a:graphicData>
-            </a:graphic>
-          </wp:inline>
-        </w:drawing>
+        <w:t>[MISSING IMAGE: Thesis_Figures/Fig_J_RMSE_Comparison.png]</w:t>
       </w:r>
     </w:p>
     <w:p>
-      <w:pPr>
-        <w:jc w:val="center"/>
-      </w:pPr>
       <w:r>
-        <w:rPr>
-          <w:i/>
-          <w:sz w:val="20"/>
-        </w:rPr>
-        <w:t>Figure 4.9a: RMSE Comparison</w:t>
+        <w:t>[MISSING IMAGE: Thesis_Figures/Fig_M_CSI_Comparison.png]</w:t>
       </w:r>
     </w:p>
     <w:p>
-      <w:pPr>
-        <w:jc w:val="center"/>
-      </w:pPr>
       <w:r>
-        <w:drawing>
-          <wp:inline xmlns:a="http://schemas.openxmlformats.org/drawingml/2006/main" xmlns:pic="http://schemas.openxmlformats.org/drawingml/2006/picture">
-            <wp:extent cx="5029200" cy="3143250"/>
-            <wp:docPr id="10" name="Picture 10"/>
-            <wp:cNvGraphicFramePr>
-              <a:graphicFrameLocks noChangeAspect="1"/>
-            </wp:cNvGraphicFramePr>
-            <a:graphic>
-              <a:graphicData uri="http://schemas.openxmlformats.org/drawingml/2006/picture">
-                <pic:pic>
-                  <pic:nvPicPr>
-                    <pic:cNvPr id="0" name="Fig_M_CSI_Comparison.png"/>
-                    <pic:cNvPicPr/>
-                  </pic:nvPicPr>
-                  <pic:blipFill>
-                    <a:blip r:embed="rId18"/>
-                    <a:stretch>
-                      <a:fillRect/>
-                    </a:stretch>
-                  </pic:blipFill>
-                  <pic:spPr>
-                    <a:xfrm>
-                      <a:off x="0" y="0"/>
-                      <a:ext cx="5029200" cy="3143250"/>
-                    </a:xfrm>
-                    <a:prstGeom prst="rect"/>
-                  </pic:spPr>
-                </pic:pic>
-              </a:graphicData>
-            </a:graphic>
-          </wp:inline>
-        </w:drawing>
-      </w:r>
-    </w:p>
-    <w:p>
-      <w:pPr>
-        <w:jc w:val="center"/>
-      </w:pPr>
-      <w:r>
-        <w:rPr>
-          <w:i/>
-          <w:sz w:val="20"/>
-        </w:rPr>
-        <w:t>Figure 4.9b: Critical Success Index Comparison</w:t>
-      </w:r>
-    </w:p>
-    <w:p>
-      <w:pPr>
-        <w:jc w:val="center"/>
-      </w:pPr>
-      <w:r>
-        <w:drawing>
-          <wp:inline xmlns:a="http://schemas.openxmlformats.org/drawingml/2006/main" xmlns:pic="http://schemas.openxmlformats.org/drawingml/2006/picture">
-            <wp:extent cx="5029200" cy="3143250"/>
-            <wp:docPr id="11" name="Picture 11"/>
-            <wp:cNvGraphicFramePr>
-              <a:graphicFrameLocks noChangeAspect="1"/>
-            </wp:cNvGraphicFramePr>
-            <a:graphic>
-              <a:graphicData uri="http://schemas.openxmlformats.org/drawingml/2006/picture">
-                <pic:pic>
-                  <pic:nvPicPr>
-                    <pic:cNvPr id="0" name="Fig_N_False_Comparison.png"/>
-                    <pic:cNvPicPr/>
-                  </pic:nvPicPr>
-                  <pic:blipFill>
-                    <a:blip r:embed="rId19"/>
-                    <a:stretch>
-                      <a:fillRect/>
-                    </a:stretch>
-                  </pic:blipFill>
-                  <pic:spPr>
-                    <a:xfrm>
-                      <a:off x="0" y="0"/>
-                      <a:ext cx="5029200" cy="3143250"/>
-                    </a:xfrm>
-                    <a:prstGeom prst="rect"/>
-                  </pic:spPr>
-                </pic:pic>
-              </a:graphicData>
-            </a:graphic>
-          </wp:inline>
-        </w:drawing>
-      </w:r>
-    </w:p>
-    <w:p>
-      <w:pPr>
-        <w:jc w:val="center"/>
-      </w:pPr>
-      <w:r>
-        <w:rPr>
-          <w:i/>
-          <w:sz w:val="20"/>
-        </w:rPr>
-        <w:t>Figure 4.9c: False Alarm Rate Comparison</w:t>
+        <w:t>[MISSING IMAGE: Thesis_Figures/Fig_N_False_Comparison.png]</w:t>
       </w:r>
     </w:p>
     <w:p>
@@ -675,54 +169,8 @@
       </w:r>
     </w:p>
     <w:p>
-      <w:pPr>
-        <w:jc w:val="center"/>
-      </w:pPr>
       <w:r>
-        <w:drawing>
-          <wp:inline xmlns:a="http://schemas.openxmlformats.org/drawingml/2006/main" xmlns:pic="http://schemas.openxmlformats.org/drawingml/2006/picture">
-            <wp:extent cx="5029200" cy="2794000"/>
-            <wp:docPr id="12" name="Picture 12"/>
-            <wp:cNvGraphicFramePr>
-              <a:graphicFrameLocks noChangeAspect="1"/>
-            </wp:cNvGraphicFramePr>
-            <a:graphic>
-              <a:graphicData uri="http://schemas.openxmlformats.org/drawingml/2006/picture">
-                <pic:pic>
-                  <pic:nvPicPr>
-                    <pic:cNvPr id="0" name="FigO_Lead_Time.png"/>
-                    <pic:cNvPicPr/>
-                  </pic:nvPicPr>
-                  <pic:blipFill>
-                    <a:blip r:embed="rId20"/>
-                    <a:stretch>
-                      <a:fillRect/>
-                    </a:stretch>
-                  </pic:blipFill>
-                  <pic:spPr>
-                    <a:xfrm>
-                      <a:off x="0" y="0"/>
-                      <a:ext cx="5029200" cy="2794000"/>
-                    </a:xfrm>
-                    <a:prstGeom prst="rect"/>
-                  </pic:spPr>
-                </pic:pic>
-              </a:graphicData>
-            </a:graphic>
-          </wp:inline>
-        </w:drawing>
-      </w:r>
-    </w:p>
-    <w:p>
-      <w:pPr>
-        <w:jc w:val="center"/>
-      </w:pPr>
-      <w:r>
-        <w:rPr>
-          <w:i/>
-          <w:sz w:val="20"/>
-        </w:rPr>
-        <w:t>Figure 4.10: Forecast Lead Time Accuracy Degradation</w:t>
+        <w:t>[MISSING IMAGE: Thesis_Figures/FigO_Lead_Time.png]</w:t>
       </w:r>
     </w:p>
     <w:p>
@@ -739,54 +187,8 @@
       </w:r>
     </w:p>
     <w:p>
-      <w:pPr>
-        <w:jc w:val="center"/>
-      </w:pPr>
       <w:r>
-        <w:drawing>
-          <wp:inline xmlns:a="http://schemas.openxmlformats.org/drawingml/2006/main" xmlns:pic="http://schemas.openxmlformats.org/drawingml/2006/picture">
-            <wp:extent cx="5029200" cy="4191000"/>
-            <wp:docPr id="13" name="Picture 13"/>
-            <wp:cNvGraphicFramePr>
-              <a:graphicFrameLocks noChangeAspect="1"/>
-            </wp:cNvGraphicFramePr>
-            <a:graphic>
-              <a:graphicData uri="http://schemas.openxmlformats.org/drawingml/2006/picture">
-                <pic:pic>
-                  <pic:nvPicPr>
-                    <pic:cNvPr id="0" name="FigP_Confusion_Matrix.png"/>
-                    <pic:cNvPicPr/>
-                  </pic:nvPicPr>
-                  <pic:blipFill>
-                    <a:blip r:embed="rId21"/>
-                    <a:stretch>
-                      <a:fillRect/>
-                    </a:stretch>
-                  </pic:blipFill>
-                  <pic:spPr>
-                    <a:xfrm>
-                      <a:off x="0" y="0"/>
-                      <a:ext cx="5029200" cy="4191000"/>
-                    </a:xfrm>
-                    <a:prstGeom prst="rect"/>
-                  </pic:spPr>
-                </pic:pic>
-              </a:graphicData>
-            </a:graphic>
-          </wp:inline>
-        </w:drawing>
-      </w:r>
-    </w:p>
-    <w:p>
-      <w:pPr>
-        <w:jc w:val="center"/>
-      </w:pPr>
-      <w:r>
-        <w:rPr>
-          <w:i/>
-          <w:sz w:val="20"/>
-        </w:rPr>
-        <w:t>Figure 4.11: Confusion Matrix for Extreme Event Classification</w:t>
+        <w:t>[MISSING IMAGE: Thesis_Figures/FigP_Confusion_Matrix.png]</w:t>
       </w:r>
     </w:p>
     <w:p>
@@ -795,105 +197,13 @@
       </w:r>
     </w:p>
     <w:p>
-      <w:pPr>
-        <w:jc w:val="center"/>
-      </w:pPr>
       <w:r>
-        <w:drawing>
-          <wp:inline xmlns:a="http://schemas.openxmlformats.org/drawingml/2006/main" xmlns:pic="http://schemas.openxmlformats.org/drawingml/2006/picture">
-            <wp:extent cx="5029200" cy="3771900"/>
-            <wp:docPr id="14" name="Picture 14"/>
-            <wp:cNvGraphicFramePr>
-              <a:graphicFrameLocks noChangeAspect="1"/>
-            </wp:cNvGraphicFramePr>
-            <a:graphic>
-              <a:graphicData uri="http://schemas.openxmlformats.org/drawingml/2006/picture">
-                <pic:pic>
-                  <pic:nvPicPr>
-                    <pic:cNvPr id="0" name="FigQ_ROC_Curve.png"/>
-                    <pic:cNvPicPr/>
-                  </pic:nvPicPr>
-                  <pic:blipFill>
-                    <a:blip r:embed="rId22"/>
-                    <a:stretch>
-                      <a:fillRect/>
-                    </a:stretch>
-                  </pic:blipFill>
-                  <pic:spPr>
-                    <a:xfrm>
-                      <a:off x="0" y="0"/>
-                      <a:ext cx="5029200" cy="3771900"/>
-                    </a:xfrm>
-                    <a:prstGeom prst="rect"/>
-                  </pic:spPr>
-                </pic:pic>
-              </a:graphicData>
-            </a:graphic>
-          </wp:inline>
-        </w:drawing>
+        <w:t>[MISSING IMAGE: Thesis_Figures/FigQ_ROC_Curve.png]</w:t>
       </w:r>
     </w:p>
     <w:p>
-      <w:pPr>
-        <w:jc w:val="center"/>
-      </w:pPr>
       <w:r>
-        <w:rPr>
-          <w:i/>
-          <w:sz w:val="20"/>
-        </w:rPr>
-        <w:t>Figure 4.12: ROC Curve</w:t>
-      </w:r>
-    </w:p>
-    <w:p>
-      <w:pPr>
-        <w:jc w:val="center"/>
-      </w:pPr>
-      <w:r>
-        <w:drawing>
-          <wp:inline xmlns:a="http://schemas.openxmlformats.org/drawingml/2006/main" xmlns:pic="http://schemas.openxmlformats.org/drawingml/2006/picture">
-            <wp:extent cx="5029200" cy="3771900"/>
-            <wp:docPr id="15" name="Picture 15"/>
-            <wp:cNvGraphicFramePr>
-              <a:graphicFrameLocks noChangeAspect="1"/>
-            </wp:cNvGraphicFramePr>
-            <a:graphic>
-              <a:graphicData uri="http://schemas.openxmlformats.org/drawingml/2006/picture">
-                <pic:pic>
-                  <pic:nvPicPr>
-                    <pic:cNvPr id="0" name="FigR_PR_Curve.png"/>
-                    <pic:cNvPicPr/>
-                  </pic:nvPicPr>
-                  <pic:blipFill>
-                    <a:blip r:embed="rId23"/>
-                    <a:stretch>
-                      <a:fillRect/>
-                    </a:stretch>
-                  </pic:blipFill>
-                  <pic:spPr>
-                    <a:xfrm>
-                      <a:off x="0" y="0"/>
-                      <a:ext cx="5029200" cy="3771900"/>
-                    </a:xfrm>
-                    <a:prstGeom prst="rect"/>
-                  </pic:spPr>
-                </pic:pic>
-              </a:graphicData>
-            </a:graphic>
-          </wp:inline>
-        </w:drawing>
-      </w:r>
-    </w:p>
-    <w:p>
-      <w:pPr>
-        <w:jc w:val="center"/>
-      </w:pPr>
-      <w:r>
-        <w:rPr>
-          <w:i/>
-          <w:sz w:val="20"/>
-        </w:rPr>
-        <w:t>Figure 4.13: Precision-Recall Tradeoff</w:t>
+        <w:t>[MISSING IMAGE: Thesis_Figures/FigR_PR_Curve.png]</w:t>
       </w:r>
     </w:p>
     <w:p>
@@ -910,54 +220,8 @@
       </w:r>
     </w:p>
     <w:p>
-      <w:pPr>
-        <w:jc w:val="center"/>
-      </w:pPr>
       <w:r>
-        <w:drawing>
-          <wp:inline xmlns:a="http://schemas.openxmlformats.org/drawingml/2006/main" xmlns:pic="http://schemas.openxmlformats.org/drawingml/2006/picture">
-            <wp:extent cx="5029200" cy="3017520"/>
-            <wp:docPr id="16" name="Picture 16"/>
-            <wp:cNvGraphicFramePr>
-              <a:graphicFrameLocks noChangeAspect="1"/>
-            </wp:cNvGraphicFramePr>
-            <a:graphic>
-              <a:graphicData uri="http://schemas.openxmlformats.org/drawingml/2006/picture">
-                <pic:pic>
-                  <pic:nvPicPr>
-                    <pic:cNvPr id="0" name="FigU_SHAP_Summary.png"/>
-                    <pic:cNvPicPr/>
-                  </pic:nvPicPr>
-                  <pic:blipFill>
-                    <a:blip r:embed="rId24"/>
-                    <a:stretch>
-                      <a:fillRect/>
-                    </a:stretch>
-                  </pic:blipFill>
-                  <pic:spPr>
-                    <a:xfrm>
-                      <a:off x="0" y="0"/>
-                      <a:ext cx="5029200" cy="3017520"/>
-                    </a:xfrm>
-                    <a:prstGeom prst="rect"/>
-                  </pic:spPr>
-                </pic:pic>
-              </a:graphicData>
-            </a:graphic>
-          </wp:inline>
-        </w:drawing>
-      </w:r>
-    </w:p>
-    <w:p>
-      <w:pPr>
-        <w:jc w:val="center"/>
-      </w:pPr>
-      <w:r>
-        <w:rPr>
-          <w:i/>
-          <w:sz w:val="20"/>
-        </w:rPr>
-        <w:t>Figure 4.14: SHAP Global Feature Importance</w:t>
+        <w:t>[MISSING IMAGE: Thesis_Figures/FigU_SHAP_Summary.png]</w:t>
       </w:r>
     </w:p>
     <w:p>
@@ -966,54 +230,8 @@
       </w:r>
     </w:p>
     <w:p>
-      <w:pPr>
-        <w:jc w:val="center"/>
-      </w:pPr>
       <w:r>
-        <w:drawing>
-          <wp:inline xmlns:a="http://schemas.openxmlformats.org/drawingml/2006/main" xmlns:pic="http://schemas.openxmlformats.org/drawingml/2006/picture">
-            <wp:extent cx="5029200" cy="2514600"/>
-            <wp:docPr id="17" name="Picture 17"/>
-            <wp:cNvGraphicFramePr>
-              <a:graphicFrameLocks noChangeAspect="1"/>
-            </wp:cNvGraphicFramePr>
-            <a:graphic>
-              <a:graphicData uri="http://schemas.openxmlformats.org/drawingml/2006/picture">
-                <pic:pic>
-                  <pic:nvPicPr>
-                    <pic:cNvPr id="0" name="FigAA_Ablation.png"/>
-                    <pic:cNvPicPr/>
-                  </pic:nvPicPr>
-                  <pic:blipFill>
-                    <a:blip r:embed="rId25"/>
-                    <a:stretch>
-                      <a:fillRect/>
-                    </a:stretch>
-                  </pic:blipFill>
-                  <pic:spPr>
-                    <a:xfrm>
-                      <a:off x="0" y="0"/>
-                      <a:ext cx="5029200" cy="2514600"/>
-                    </a:xfrm>
-                    <a:prstGeom prst="rect"/>
-                  </pic:spPr>
-                </pic:pic>
-              </a:graphicData>
-            </a:graphic>
-          </wp:inline>
-        </w:drawing>
-      </w:r>
-    </w:p>
-    <w:p>
-      <w:pPr>
-        <w:jc w:val="center"/>
-      </w:pPr>
-      <w:r>
-        <w:rPr>
-          <w:i/>
-          <w:sz w:val="20"/>
-        </w:rPr>
-        <w:t>Figure 4.15: Architectural Ablation Study Comparison</w:t>
+        <w:t>[MISSING IMAGE: Thesis_Figures/FigAA_Ablation.png]</w:t>
       </w:r>
     </w:p>
     <w:p>
@@ -1065,7 +283,7 @@
     </w:p>
     <w:p>
       <w:r>
-        <w:t>By integrating 1D Convolutional layers for spatial feature extraction, Bidirectional LSTMs for chronological memory, and an Attention mechanism to prioritize peak intensity days, the system achieved a champion accuracy of 97.43% with a minimal RMSE of 3.63mm. The rigorous evaluation harness, including Walk-Forward validation, SHAP explainability, and paired statistical testing, establishes this framework as a highly robust, operationally viable tool for early disaster warning in the context of escalating global climate volatility.</w:t>
+        <w:t>By integrating 1D Convolutional layers for spatial feature extraction, Bidirectional LSTMs for chronological memory, and an Attention mechanism to prioritize peak intensity days, the system achieved a champion accuracy of 97.29% with a minimal RMSE of 3.70mm. The rigorous evaluation harness, including Walk-Forward validation, SHAP explainability, and paired statistical testing, establishes this framework as a highly robust, operationally viable tool for early disaster warning in the context of escalating global climate volatility.</w:t>
       </w:r>
     </w:p>
     <w:sectPr>

</xml_diff>